<commit_message>
docs: update UTS report document
</commit_message>
<xml_diff>
--- a/laporan/UTS_247006111152_ZhekaBailaArkan.docx
+++ b/laporan/UTS_247006111152_ZhekaBailaArkan.docx
@@ -4,44 +4,17 @@
   <w:body>
     <w:p>
       <w:pPr>
-        <w:spacing w:after="0"/>
-        <w:jc w:val="center"/>
-      </w:pPr>
-      <w:r>
-        <w:rPr>
-          <w:b/>
-          <w:sz w:val="28"/>
-          <w:szCs w:val="28"/>
-        </w:rPr>
-        <w:t>LAPORAN UJIAN TENGAH SEMESTER</w:t>
-      </w:r>
-    </w:p>
-    <w:p>
-      <w:pPr>
-        <w:spacing w:after="0"/>
-        <w:jc w:val="center"/>
-      </w:pPr>
-      <w:r>
-        <w:rPr>
-          <w:b/>
-          <w:sz w:val="28"/>
-          <w:szCs w:val="28"/>
-        </w:rPr>
-        <w:t>Komputasi Paralel dan Terdistribusi</w:t>
-      </w:r>
-    </w:p>
-    <w:p>
-      <w:pPr>
-        <w:spacing w:after="360"/>
-        <w:jc w:val="center"/>
-      </w:pPr>
-      <w:r>
-        <w:rPr>
-          <w:b/>
-          <w:sz w:val="26"/>
-          <w:szCs w:val="26"/>
-        </w:rPr>
-        <w:t>Proyek Parallel Log File Analyzer</w:t>
+        <w:tabs>
+          <w:tab w:val="left" w:pos="2835"/>
+        </w:tabs>
+        <w:spacing w:after="40" w:line="300" w:lineRule="auto"/>
+      </w:pPr>
+      <w:r>
+        <w:t>Nama</w:t>
+      </w:r>
+      <w:r>
+        <w:tab/>
+        <w:t>: Zheka Baila Arkan</w:t>
       </w:r>
     </w:p>
     <w:p>
@@ -53,11 +26,11 @@
         <w:ind w:left="2835" w:hanging="2835"/>
       </w:pPr>
       <w:r>
-        <w:t>Nama</w:t>
+        <w:t>NPM</w:t>
       </w:r>
       <w:r>
         <w:tab/>
-        <w:t>: Zheka Baila Arkan</w:t>
+        <w:t>: 247006111152</w:t>
       </w:r>
     </w:p>
     <w:p>
@@ -69,11 +42,11 @@
         <w:ind w:left="2835" w:hanging="2835"/>
       </w:pPr>
       <w:r>
-        <w:t>NPM</w:t>
+        <w:t>Kelas</w:t>
       </w:r>
       <w:r>
         <w:tab/>
-        <w:t>: 247006111152</w:t>
+        <w:t>: A</w:t>
       </w:r>
     </w:p>
     <w:p>
@@ -85,34 +58,15 @@
         <w:ind w:left="2835" w:hanging="2835"/>
       </w:pPr>
       <w:r>
-        <w:t>Kelas</w:t>
+        <w:t>Mata Kuliah</w:t>
       </w:r>
       <w:r>
         <w:tab/>
-        <w:t>: A</w:t>
+        <w:t>: Komputasi Paralel dan Terdistribusi</w:t>
       </w:r>
     </w:p>
     <w:p>
       <w:pPr>
-        <w:tabs>
-          <w:tab w:val="left" w:pos="2835"/>
-        </w:tabs>
-        <w:spacing w:after="40" w:line="300" w:lineRule="auto"/>
-        <w:ind w:left="2835" w:hanging="2835"/>
-      </w:pPr>
-      <w:r>
-        <w:t>Mata Kuliah</w:t>
-      </w:r>
-      <w:r>
-        <w:tab/>
-        <w:t>: Komputasi Paralel dan Terdistribusi</w:t>
-      </w:r>
-    </w:p>
-    <w:p>
-      <w:pPr>
-        <w:pBdr>
-          <w:bottom w:val="single" w:sz="8" w:space="6" w:color="000000"/>
-        </w:pBdr>
         <w:tabs>
           <w:tab w:val="left" w:pos="2835"/>
         </w:tabs>
@@ -124,8 +78,30 @@
       </w:r>
       <w:r>
         <w:tab/>
-        <w:t>: Python 3.14.4, pytest, dan matplotlib</w:t>
-      </w:r>
+        <w:t xml:space="preserve">: Python 3.14.4, </w:t>
+      </w:r>
+      <w:proofErr w:type="spellStart"/>
+      <w:r>
+        <w:t>pytest</w:t>
+      </w:r>
+      <w:proofErr w:type="spellEnd"/>
+      <w:r>
+        <w:t xml:space="preserve">, dan </w:t>
+      </w:r>
+      <w:proofErr w:type="spellStart"/>
+      <w:r>
+        <w:t>matplotlib</w:t>
+      </w:r>
+      <w:proofErr w:type="spellEnd"/>
+    </w:p>
+    <w:p>
+      <w:pPr>
+        <w:tabs>
+          <w:tab w:val="left" w:pos="2835"/>
+        </w:tabs>
+        <w:spacing w:line="300" w:lineRule="auto"/>
+        <w:ind w:left="2835" w:hanging="2835"/>
+      </w:pPr>
     </w:p>
     <w:p>
       <w:pPr>
@@ -416,7 +392,6 @@
                 <w:sz w:val="18"/>
                 <w:szCs w:val="18"/>
               </w:rPr>
-              <w:lastRenderedPageBreak/>
               <w:t>def compute_chunks(file_size, num_chunks):</w:t>
             </w:r>
           </w:p>
@@ -481,6 +456,7 @@
         <w:jc w:val="both"/>
       </w:pPr>
       <w:r>
+        <w:lastRenderedPageBreak/>
         <w:t>Aturan kepemilikan baris adalah sebagai berikut: satu baris dimiliki oleh potongan (</w:t>
       </w:r>
       <w:r>
@@ -1367,7 +1343,6 @@
                 <w:sz w:val="22"/>
                 <w:szCs w:val="22"/>
               </w:rPr>
-              <w:lastRenderedPageBreak/>
               <w:t xml:space="preserve">Hasil </w:t>
             </w:r>
             <w:r>
@@ -1670,6 +1645,7 @@
                 <w:sz w:val="22"/>
                 <w:szCs w:val="22"/>
               </w:rPr>
+              <w:lastRenderedPageBreak/>
               <w:t>Batasan utama</w:t>
             </w:r>
           </w:p>
@@ -11498,19 +11474,7 @@
         <w:rPr>
           <w:b/>
         </w:rPr>
-        <w:t xml:space="preserve">Gambar </w:t>
-      </w:r>
-      <w:r>
-        <w:rPr>
-          <w:b/>
-        </w:rPr>
-        <w:t>5</w:t>
-      </w:r>
-      <w:r>
-        <w:rPr>
-          <w:b/>
-        </w:rPr>
-        <w:t xml:space="preserve">. </w:t>
+        <w:t xml:space="preserve">Gambar 5. </w:t>
       </w:r>
       <w:proofErr w:type="spellStart"/>
       <w:r>

</xml_diff>